<commit_message>
Edit formating until tables
</commit_message>
<xml_diff>
--- a/Quarto_report/custom-reference-doc.docx
+++ b/Quarto_report/custom-reference-doc.docx
@@ -5,73 +5,40 @@
     <w:p>
       <w:pPr>
         <w:pStyle w:val="Title"/>
-        <w:rPr>
-          <w:color w:val="FF0000"/>
-        </w:rPr>
-      </w:pPr>
-      <w:r>
-        <w:t xml:space="preserve"> </w:t>
-      </w:r>
-      <w:r>
-        <w:rPr>
-          <w:color w:val="FF0000"/>
-        </w:rPr>
-        <w:t xml:space="preserve">Title </w:t>
+      </w:pPr>
+      <w:r>
+        <w:t xml:space="preserve"> Title </w:t>
       </w:r>
     </w:p>
     <w:p>
       <w:pPr>
         <w:pStyle w:val="Subtitle"/>
-        <w:rPr>
-          <w:color w:val="FF0000"/>
-        </w:rPr>
-      </w:pPr>
-      <w:r>
-        <w:rPr>
-          <w:color w:val="FF0000"/>
-        </w:rPr>
+      </w:pPr>
+      <w:r>
         <w:t xml:space="preserve"> Subtitle </w:t>
       </w:r>
     </w:p>
     <w:p>
       <w:pPr>
         <w:pStyle w:val="Author"/>
-        <w:rPr>
-          <w:color w:val="FF0000"/>
-        </w:rPr>
-      </w:pPr>
-      <w:r>
-        <w:rPr>
-          <w:color w:val="FF0000"/>
-        </w:rPr>
+      </w:pPr>
+      <w:r>
         <w:t xml:space="preserve"> Author </w:t>
       </w:r>
     </w:p>
     <w:p>
       <w:pPr>
         <w:pStyle w:val="Date"/>
-        <w:rPr>
-          <w:color w:val="FF0000"/>
-        </w:rPr>
-      </w:pPr>
-      <w:r>
-        <w:rPr>
-          <w:color w:val="FF0000"/>
-        </w:rPr>
+      </w:pPr>
+      <w:r>
         <w:t xml:space="preserve"> Date </w:t>
       </w:r>
     </w:p>
     <w:p>
       <w:pPr>
         <w:pStyle w:val="Abstract"/>
-        <w:rPr>
-          <w:color w:val="FF0000"/>
-        </w:rPr>
-      </w:pPr>
-      <w:r>
-        <w:rPr>
-          <w:color w:val="FF0000"/>
-        </w:rPr>
+      </w:pPr>
+      <w:r>
         <w:t xml:space="preserve"> Abstract </w:t>
       </w:r>
     </w:p>
@@ -79,13 +46,13 @@
       <w:pPr>
         <w:pStyle w:val="Heading1"/>
         <w:rPr>
-          <w:color w:val="FF0000"/>
+          <w:color w:val="auto"/>
         </w:rPr>
       </w:pPr>
       <w:bookmarkStart w:id="0" w:name="heading-1"/>
       <w:r>
         <w:rPr>
-          <w:color w:val="FF0000"/>
+          <w:color w:val="auto"/>
         </w:rPr>
         <w:t xml:space="preserve"> Heading 1 </w:t>
       </w:r>
@@ -95,13 +62,13 @@
       <w:pPr>
         <w:pStyle w:val="Heading2"/>
         <w:rPr>
-          <w:color w:val="FF0000"/>
+          <w:color w:val="auto"/>
         </w:rPr>
       </w:pPr>
       <w:bookmarkStart w:id="1" w:name="heading-2"/>
       <w:r>
         <w:rPr>
-          <w:color w:val="FF0000"/>
+          <w:color w:val="auto"/>
         </w:rPr>
         <w:t xml:space="preserve"> Heading 2 </w:t>
       </w:r>
@@ -111,13 +78,13 @@
       <w:pPr>
         <w:pStyle w:val="Heading3"/>
         <w:rPr>
-          <w:color w:val="FF0000"/>
+          <w:color w:val="auto"/>
         </w:rPr>
       </w:pPr>
       <w:bookmarkStart w:id="2" w:name="heading-3"/>
       <w:r>
         <w:rPr>
-          <w:color w:val="FF0000"/>
+          <w:color w:val="auto"/>
         </w:rPr>
         <w:t xml:space="preserve"> Heading 3 </w:t>
       </w:r>
@@ -127,13 +94,13 @@
       <w:pPr>
         <w:pStyle w:val="Heading4"/>
         <w:rPr>
-          <w:color w:val="FF0000"/>
+          <w:color w:val="auto"/>
         </w:rPr>
       </w:pPr>
       <w:bookmarkStart w:id="3" w:name="heading-4"/>
       <w:r>
         <w:rPr>
-          <w:color w:val="FF0000"/>
+          <w:color w:val="auto"/>
         </w:rPr>
         <w:t xml:space="preserve"> Heading 4 </w:t>
       </w:r>
@@ -143,13 +110,13 @@
       <w:pPr>
         <w:pStyle w:val="Heading5"/>
         <w:rPr>
-          <w:color w:val="FF0000"/>
+          <w:color w:val="auto"/>
         </w:rPr>
       </w:pPr>
       <w:bookmarkStart w:id="4" w:name="heading-5"/>
       <w:r>
         <w:rPr>
-          <w:color w:val="FF0000"/>
+          <w:color w:val="auto"/>
         </w:rPr>
         <w:t xml:space="preserve"> Heading 5 </w:t>
       </w:r>
@@ -159,13 +126,13 @@
       <w:pPr>
         <w:pStyle w:val="Heading6"/>
         <w:rPr>
-          <w:color w:val="FF0000"/>
+          <w:color w:val="auto"/>
         </w:rPr>
       </w:pPr>
       <w:bookmarkStart w:id="5" w:name="heading-6"/>
       <w:r>
         <w:rPr>
-          <w:color w:val="FF0000"/>
+          <w:color w:val="auto"/>
         </w:rPr>
         <w:t xml:space="preserve"> Heading 6 </w:t>
       </w:r>
@@ -175,13 +142,13 @@
       <w:pPr>
         <w:pStyle w:val="Heading7"/>
         <w:rPr>
-          <w:color w:val="FF0000"/>
+          <w:color w:val="auto"/>
         </w:rPr>
       </w:pPr>
       <w:bookmarkStart w:id="6" w:name="heading-7"/>
       <w:r>
         <w:rPr>
-          <w:color w:val="FF0000"/>
+          <w:color w:val="auto"/>
         </w:rPr>
         <w:t xml:space="preserve"> Heading 7 </w:t>
       </w:r>
@@ -191,13 +158,13 @@
       <w:pPr>
         <w:pStyle w:val="Heading8"/>
         <w:rPr>
-          <w:color w:val="FF0000"/>
+          <w:color w:val="auto"/>
         </w:rPr>
       </w:pPr>
       <w:bookmarkStart w:id="7" w:name="heading-8"/>
       <w:r>
         <w:rPr>
-          <w:color w:val="FF0000"/>
+          <w:color w:val="auto"/>
         </w:rPr>
         <w:t xml:space="preserve"> Heading 8 </w:t>
       </w:r>
@@ -207,13 +174,13 @@
       <w:pPr>
         <w:pStyle w:val="Heading9"/>
         <w:rPr>
-          <w:color w:val="FF0000"/>
+          <w:color w:val="auto"/>
         </w:rPr>
       </w:pPr>
       <w:bookmarkStart w:id="8" w:name="heading-9"/>
       <w:r>
         <w:rPr>
-          <w:color w:val="FF0000"/>
+          <w:color w:val="auto"/>
         </w:rPr>
         <w:t xml:space="preserve"> Heading 9 </w:t>
       </w:r>
@@ -222,34 +189,21 @@
     <w:p>
       <w:pPr>
         <w:pStyle w:val="FirstParagraph"/>
-        <w:rPr>
-          <w:color w:val="FF0000"/>
-        </w:rPr>
-      </w:pPr>
-      <w:r>
-        <w:rPr>
-          <w:color w:val="FF0000"/>
-        </w:rPr>
+      </w:pPr>
+      <w:r>
         <w:t xml:space="preserve"> First Paragraph. </w:t>
       </w:r>
     </w:p>
     <w:p>
       <w:pPr>
         <w:pStyle w:val="BodyText"/>
-        <w:rPr>
-          <w:color w:val="FF0000"/>
-        </w:rPr>
-      </w:pPr>
-      <w:r>
-        <w:rPr>
-          <w:color w:val="FF0000"/>
-        </w:rPr>
+      </w:pPr>
+      <w:r>
         <w:t xml:space="preserve"> Body Text. Body Text Char.    </w:t>
       </w:r>
       <w:r>
         <w:rPr>
           <w:rStyle w:val="VerbatimChar"/>
-          <w:color w:val="FF0000"/>
         </w:rPr>
         <w:t xml:space="preserve"> Verbatim </w:t>
       </w:r>
@@ -257,42 +211,31 @@
       <w:r>
         <w:rPr>
           <w:rStyle w:val="VerbatimChar"/>
-          <w:color w:val="FF0000"/>
         </w:rPr>
         <w:t xml:space="preserve">Char </w:t>
       </w:r>
       <w:r>
-        <w:rPr>
-          <w:color w:val="FF0000"/>
-        </w:rPr>
         <w:t xml:space="preserve"> .</w:t>
       </w:r>
       <w:proofErr w:type="gramEnd"/>
       <w:r>
-        <w:rPr>
-          <w:color w:val="FF0000"/>
-        </w:rPr>
         <w:t xml:space="preserve">    </w:t>
       </w:r>
       <w:hyperlink r:id="rId7">
         <w:r>
           <w:rPr>
             <w:rStyle w:val="Hyperlink"/>
-            <w:color w:val="FF0000"/>
+            <w:color w:val="auto"/>
           </w:rPr>
           <w:t xml:space="preserve"> Hyperlink </w:t>
         </w:r>
       </w:hyperlink>
       <w:r>
-        <w:rPr>
-          <w:color w:val="FF0000"/>
-        </w:rPr>
         <w:t xml:space="preserve"> .     Footnote. </w:t>
       </w:r>
       <w:r>
         <w:rPr>
           <w:rStyle w:val="FootnoteReference"/>
-          <w:color w:val="FF0000"/>
         </w:rPr>
         <w:footnoteReference w:id="1"/>
       </w:r>
@@ -300,28 +243,16 @@
     <w:p>
       <w:pPr>
         <w:pStyle w:val="BlockText"/>
-        <w:rPr>
-          <w:color w:val="FF0000"/>
-        </w:rPr>
-      </w:pPr>
-      <w:r>
-        <w:rPr>
-          <w:color w:val="FF0000"/>
-        </w:rPr>
+      </w:pPr>
+      <w:r>
         <w:t xml:space="preserve"> Block Text. </w:t>
       </w:r>
     </w:p>
     <w:p>
       <w:pPr>
         <w:pStyle w:val="TableCaption"/>
-        <w:rPr>
-          <w:color w:val="FF0000"/>
-        </w:rPr>
-      </w:pPr>
-      <w:r>
-        <w:rPr>
-          <w:color w:val="FF0000"/>
-        </w:rPr>
+      </w:pPr>
+      <w:r>
         <w:t xml:space="preserve"> Table caption. </w:t>
       </w:r>
     </w:p>
@@ -346,14 +277,8 @@
           <w:p>
             <w:pPr>
               <w:pStyle w:val="Compact"/>
-              <w:rPr>
-                <w:color w:val="FF0000"/>
-              </w:rPr>
             </w:pPr>
             <w:r>
-              <w:rPr>
-                <w:color w:val="FF0000"/>
-              </w:rPr>
               <w:t xml:space="preserve"> Table </w:t>
             </w:r>
           </w:p>
@@ -365,14 +290,8 @@
           <w:p>
             <w:pPr>
               <w:pStyle w:val="Compact"/>
-              <w:rPr>
-                <w:color w:val="FF0000"/>
-              </w:rPr>
             </w:pPr>
             <w:r>
-              <w:rPr>
-                <w:color w:val="FF0000"/>
-              </w:rPr>
               <w:t xml:space="preserve"> Table </w:t>
             </w:r>
           </w:p>
@@ -386,14 +305,8 @@
           <w:p>
             <w:pPr>
               <w:pStyle w:val="Compact"/>
-              <w:rPr>
-                <w:color w:val="FF0000"/>
-              </w:rPr>
             </w:pPr>
             <w:r>
-              <w:rPr>
-                <w:color w:val="FF0000"/>
-              </w:rPr>
               <w:t xml:space="preserve"> 1 </w:t>
             </w:r>
           </w:p>
@@ -405,14 +318,8 @@
           <w:p>
             <w:pPr>
               <w:pStyle w:val="Compact"/>
-              <w:rPr>
-                <w:color w:val="FF0000"/>
-              </w:rPr>
             </w:pPr>
             <w:r>
-              <w:rPr>
-                <w:color w:val="FF0000"/>
-              </w:rPr>
               <w:t xml:space="preserve"> 2 </w:t>
             </w:r>
           </w:p>
@@ -422,7 +329,39 @@
     <w:p>
       <w:pPr>
         <w:pStyle w:val="ImageCaption"/>
-        <w:rPr>
+      </w:pPr>
+      <w:r>
+        <w:t xml:space="preserve"> Image Caption </w:t>
+      </w:r>
+    </w:p>
+    <w:p>
+      <w:pPr>
+        <w:pStyle w:val="DefinitionTerm"/>
+      </w:pPr>
+      <w:r>
+        <w:t xml:space="preserve"> DefinitionTerm </w:t>
+      </w:r>
+    </w:p>
+    <w:p>
+      <w:pPr>
+        <w:pStyle w:val="Definition"/>
+      </w:pPr>
+      <w:r>
+        <w:t xml:space="preserve"> Definition </w:t>
+      </w:r>
+    </w:p>
+    <w:p>
+      <w:pPr>
+        <w:pStyle w:val="DefinitionTerm"/>
+      </w:pPr>
+      <w:r>
+        <w:t xml:space="preserve"> DefinitionTerm </w:t>
+      </w:r>
+    </w:p>
+    <w:p>
+      <w:pPr>
+        <w:rPr>
+          <w:b/>
           <w:color w:val="FF0000"/>
         </w:rPr>
       </w:pPr>
@@ -430,7 +369,7 @@
         <w:rPr>
           <w:color w:val="FF0000"/>
         </w:rPr>
-        <w:t xml:space="preserve"> Image Caption </w:t>
+        <w:br w:type="page"/>
       </w:r>
     </w:p>
     <w:p>
@@ -440,12 +379,28 @@
           <w:color w:val="FF0000"/>
         </w:rPr>
       </w:pPr>
-      <w:r>
-        <w:rPr>
+    </w:p>
+    <w:p>
+      <w:pPr>
+        <w:rPr>
+          <w:b/>
           <w:color w:val="FF0000"/>
         </w:rPr>
-        <w:t xml:space="preserve"> DefinitionTerm </w:t>
-      </w:r>
+      </w:pPr>
+      <w:r>
+        <w:rPr>
+          <w:color w:val="FF0000"/>
+        </w:rPr>
+        <w:br w:type="page"/>
+      </w:r>
+    </w:p>
+    <w:p>
+      <w:pPr>
+        <w:pStyle w:val="DefinitionTerm"/>
+        <w:rPr>
+          <w:color w:val="FF0000"/>
+        </w:rPr>
+      </w:pPr>
     </w:p>
     <w:p>
       <w:pPr>
@@ -461,38 +416,14 @@
         <w:t xml:space="preserve"> Definition </w:t>
       </w:r>
     </w:p>
-    <w:p>
-      <w:pPr>
-        <w:pStyle w:val="DefinitionTerm"/>
-        <w:rPr>
-          <w:color w:val="FF0000"/>
-        </w:rPr>
-      </w:pPr>
-      <w:r>
-        <w:rPr>
-          <w:color w:val="FF0000"/>
-        </w:rPr>
-        <w:t xml:space="preserve"> DefinitionTerm </w:t>
-      </w:r>
-    </w:p>
-    <w:p>
-      <w:pPr>
-        <w:pStyle w:val="Definition"/>
-        <w:rPr>
-          <w:color w:val="FF0000"/>
-        </w:rPr>
-      </w:pPr>
-      <w:r>
-        <w:rPr>
-          <w:color w:val="FF0000"/>
-        </w:rPr>
-        <w:t xml:space="preserve"> Definition </w:t>
-      </w:r>
-    </w:p>
     <w:sectPr>
+      <w:footerReference w:type="default" r:id="rId8"/>
       <w:pgSz w:w="12240" w:h="15840"/>
       <w:pgMar w:top="1440" w:right="1440" w:bottom="1440" w:left="1440" w:header="720" w:footer="720" w:gutter="0"/>
+      <w:pgNumType w:start="1"/>
       <w:cols w:space="720"/>
+      <w:titlePg/>
+      <w:docGrid w:linePitch="326"/>
     </w:sectPr>
   </w:body>
 </w:document>
@@ -521,6 +452,59 @@
     </w:p>
   </w:endnote>
 </w:endnotes>
+</file>
+
+<file path=word/footer1.xml><?xml version="1.0" encoding="utf-8"?>
+<w:ftr xmlns:wpc="http://schemas.microsoft.com/office/word/2010/wordprocessingCanvas" xmlns:cx="http://schemas.microsoft.com/office/drawing/2014/chartex" xmlns:cx1="http://schemas.microsoft.com/office/drawing/2015/9/8/chartex" xmlns:cx2="http://schemas.microsoft.com/office/drawing/2015/10/21/chartex" xmlns:cx3="http://schemas.microsoft.com/office/drawing/2016/5/9/chartex" xmlns:cx4="http://schemas.microsoft.com/office/drawing/2016/5/10/chartex" xmlns:cx5="http://schemas.microsoft.com/office/drawing/2016/5/11/chartex" xmlns:cx6="http://schemas.microsoft.com/office/drawing/2016/5/12/chartex" xmlns:cx7="http://schemas.microsoft.com/office/drawing/2016/5/13/chartex" xmlns:cx8="http://schemas.microsoft.com/office/drawing/2016/5/14/chartex" xmlns:mc="http://schemas.openxmlformats.org/markup-compatibility/2006" xmlns:aink="http://schemas.microsoft.com/office/drawing/2016/ink" xmlns:am3d="http://schemas.microsoft.com/office/drawing/2017/model3d" xmlns:o="urn:schemas-microsoft-com:office:office" xmlns:oel="http://schemas.microsoft.com/office/2019/extlst" xmlns:r="http://schemas.openxmlformats.org/officeDocument/2006/relationships" xmlns:m="http://schemas.openxmlformats.org/officeDocument/2006/math" xmlns:v="urn:schemas-microsoft-com:vml" xmlns:wp14="http://schemas.microsoft.com/office/word/2010/wordprocessingDrawing" xmlns:wp="http://schemas.openxmlformats.org/drawingml/2006/wordprocessingDrawing" xmlns:w10="urn:schemas-microsoft-com:office:word" xmlns:w="http://schemas.openxmlformats.org/wordprocessingml/2006/main" xmlns:w14="http://schemas.microsoft.com/office/word/2010/wordml" xmlns:w15="http://schemas.microsoft.com/office/word/2012/wordml" xmlns:w16cex="http://schemas.microsoft.com/office/word/2018/wordml/cex" xmlns:w16cid="http://schemas.microsoft.com/office/word/2016/wordml/cid" xmlns:w16="http://schemas.microsoft.com/office/word/2018/wordml" xmlns:w16du="http://schemas.microsoft.com/office/word/2023/wordml/word16du" xmlns:w16sdtdh="http://schemas.microsoft.com/office/word/2020/wordml/sdtdatahash" xmlns:w16sdtfl="http://schemas.microsoft.com/office/word/2024/wordml/sdtformatlock" xmlns:w16se="http://schemas.microsoft.com/office/word/2015/wordml/symex" xmlns:wpg="http://schemas.microsoft.com/office/word/2010/wordprocessingGroup" xmlns:wpi="http://schemas.microsoft.com/office/word/2010/wordprocessingInk" xmlns:wne="http://schemas.microsoft.com/office/word/2006/wordml" xmlns:wps="http://schemas.microsoft.com/office/word/2010/wordprocessingShape" mc:Ignorable="w14 w15 w16se w16cid w16 w16cex w16sdtdh w16sdtfl w16du wp14">
+  <w:sdt>
+    <w:sdtPr>
+      <w:id w:val="-2035721828"/>
+      <w:docPartObj>
+        <w:docPartGallery w:val="Page Numbers (Bottom of Page)"/>
+        <w:docPartUnique/>
+      </w:docPartObj>
+    </w:sdtPr>
+    <w:sdtEndPr>
+      <w:rPr>
+        <w:noProof/>
+      </w:rPr>
+    </w:sdtEndPr>
+    <w:sdtContent>
+      <w:p>
+        <w:pPr>
+          <w:pStyle w:val="Footer"/>
+          <w:jc w:val="right"/>
+        </w:pPr>
+        <w:r>
+          <w:fldChar w:fldCharType="begin"/>
+        </w:r>
+        <w:r>
+          <w:instrText xml:space="preserve"> PAGE   \* MERGEFORMAT </w:instrText>
+        </w:r>
+        <w:r>
+          <w:fldChar w:fldCharType="separate"/>
+        </w:r>
+        <w:r>
+          <w:rPr>
+            <w:noProof/>
+          </w:rPr>
+          <w:t>2</w:t>
+        </w:r>
+        <w:r>
+          <w:rPr>
+            <w:noProof/>
+          </w:rPr>
+          <w:fldChar w:fldCharType="end"/>
+        </w:r>
+      </w:p>
+    </w:sdtContent>
+  </w:sdt>
+  <w:p>
+    <w:pPr>
+      <w:pStyle w:val="Footer"/>
+    </w:pPr>
+  </w:p>
+</w:ftr>
 </file>
 
 <file path=word/footnotes.xml><?xml version="1.0" encoding="utf-8"?>
@@ -688,6 +672,7 @@
     </w:pPrDefault>
   </w:docDefaults>
   <w:latentStyles w:defLockedState="0" w:defUIPriority="0" w:defSemiHidden="0" w:defUnhideWhenUsed="0" w:defQFormat="0" w:count="376">
+    <w:lsdException w:name="footer" w:uiPriority="99"/>
     <w:lsdException w:name="Normal Table" w:semiHidden="1" w:unhideWhenUsed="1"/>
     <w:lsdException w:name="Table Simple 1" w:semiHidden="1" w:unhideWhenUsed="1"/>
     <w:lsdException w:name="Table Simple 2" w:semiHidden="1" w:unhideWhenUsed="1"/>
@@ -1586,6 +1571,46 @@
       <w:spacing w:before="240" w:line="259" w:lineRule="auto"/>
       <w:outlineLvl w:val="9"/>
     </w:pPr>
+  </w:style>
+  <w:style w:type="paragraph" w:styleId="Header">
+    <w:name w:val="header"/>
+    <w:basedOn w:val="Normal"/>
+    <w:link w:val="HeaderChar"/>
+    <w:rsid w:val="009F57A2"/>
+    <w:pPr>
+      <w:tabs>
+        <w:tab w:val="center" w:pos="4513"/>
+        <w:tab w:val="right" w:pos="9026"/>
+      </w:tabs>
+      <w:spacing w:after="0"/>
+    </w:pPr>
+  </w:style>
+  <w:style w:type="character" w:customStyle="1" w:styleId="HeaderChar">
+    <w:name w:val="Header Char"/>
+    <w:basedOn w:val="DefaultParagraphFont"/>
+    <w:link w:val="Header"/>
+    <w:rsid w:val="009F57A2"/>
+  </w:style>
+  <w:style w:type="paragraph" w:styleId="Footer">
+    <w:name w:val="footer"/>
+    <w:basedOn w:val="Normal"/>
+    <w:link w:val="FooterChar"/>
+    <w:uiPriority w:val="99"/>
+    <w:rsid w:val="009F57A2"/>
+    <w:pPr>
+      <w:tabs>
+        <w:tab w:val="center" w:pos="4513"/>
+        <w:tab w:val="right" w:pos="9026"/>
+      </w:tabs>
+      <w:spacing w:after="0"/>
+    </w:pPr>
+  </w:style>
+  <w:style w:type="character" w:customStyle="1" w:styleId="FooterChar">
+    <w:name w:val="Footer Char"/>
+    <w:basedOn w:val="DefaultParagraphFont"/>
+    <w:link w:val="Footer"/>
+    <w:uiPriority w:val="99"/>
+    <w:rsid w:val="009F57A2"/>
   </w:style>
 </w:styles>
 </file>

</xml_diff>